<commit_message>
feat: retain signature, add image upload for signature, and map checkboxes to Word document
</commit_message>
<xml_diff>
--- a/platform/public/template.docx
+++ b/platform/public/template.docx
@@ -3404,19 +3404,6 @@
                 <w:b/>
                 <w:color w:val="0000FF"/>
               </w:rPr>
-              <w:t>+++relativesInEtisalat+++</w:t>
-            </w:r>
-          </w:p>
-          <w:p>
-            <w:pPr>
-              <w:spacing w:before="0" w:after="0"/>
-              <w:jc w:val="center"/>
-            </w:pPr>
-            <w:r>
-              <w:rPr>
-                <w:b/>
-                <w:color w:val="0000FF"/>
-              </w:rPr>
               <w:t>+++relativeDetails+++</w:t>
             </w:r>
           </w:p>
@@ -3432,59 +3419,20 @@
           </w:tcPr>
           <w:p>
             <w:pPr>
-              <w:jc w:val="center"/>
-              <w:rPr>
-                <w:b/>
-                <w:bCs/>
-              </w:rPr>
-            </w:pPr>
-            <w:r>
-              <w:rPr>
-                <w:b/>
-                <w:bCs/>
+              <w:spacing w:before="0" w:after="0"/>
+              <w:jc w:val="center"/>
+            </w:pPr>
+            <w:r/>
+            <w:r>
+              <w:rPr>
+                <w:b/>
+                <w:color w:val="0000FF"/>
               </w:rPr>
               <w:t>YES</w:t>
-            </w:r>
-          </w:p>
-          <w:sdt>
-            <w:sdtPr>
-              <w:rPr>
-                <w:b/>
-                <w:bCs/>
-                <w:sz w:val="40"/>
-                <w:szCs w:val="40"/>
-              </w:rPr>
-              <w:id w:val="1797173647"/>
-              <w14:checkbox>
-                <w14:checked w14:val="0"/>
-                <w14:checkedState w14:val="2612" w14:font="MS Gothic"/>
-                <w14:uncheckedState w14:val="2610" w14:font="MS Gothic"/>
-              </w14:checkbox>
-            </w:sdtPr>
-            <w:sdtContent>
-              <w:p>
-                <w:pPr>
-                  <w:jc w:val="center"/>
-                  <w:rPr>
-                    <w:b/>
-                    <w:bCs/>
-                    <w:sz w:val="40"/>
-                    <w:szCs w:val="40"/>
-                  </w:rPr>
-                </w:pPr>
-                <w:r>
-                  <w:rPr>
-                    <w:rFonts w:ascii="MS Gothic" w:eastAsia="MS Gothic" w:hAnsi="MS Gothic" w:hint="eastAsia"/>
-                    <w:b/>
-                    <w:bCs/>
-                    <w:sz w:val="40"/>
-                    <w:szCs w:val="40"/>
-                  </w:rPr>
-                  <w:t>☐</w:t>
-                </w:r>
-              </w:p>
-            </w:sdtContent>
-          </w:sdt>
+              <w:br/>
+              <w:t>+++rel_yes+++</w:t>
+            </w:r>
+          </w:p>
         </w:tc>
         <w:tc>
           <w:tcPr>
@@ -3497,59 +3445,20 @@
           </w:tcPr>
           <w:p>
             <w:pPr>
-              <w:jc w:val="center"/>
-              <w:rPr>
-                <w:b/>
-                <w:bCs/>
-              </w:rPr>
-            </w:pPr>
-            <w:r>
-              <w:rPr>
-                <w:b/>
-                <w:bCs/>
+              <w:spacing w:before="0" w:after="0"/>
+              <w:jc w:val="center"/>
+            </w:pPr>
+            <w:r/>
+            <w:r>
+              <w:rPr>
+                <w:b/>
+                <w:color w:val="0000FF"/>
               </w:rPr>
               <w:t>NO</w:t>
-            </w:r>
-          </w:p>
-          <w:sdt>
-            <w:sdtPr>
-              <w:rPr>
-                <w:b/>
-                <w:bCs/>
-                <w:sz w:val="40"/>
-                <w:szCs w:val="40"/>
-              </w:rPr>
-              <w:id w:val="-531033478"/>
-              <w14:checkbox>
-                <w14:checked w14:val="0"/>
-                <w14:checkedState w14:val="2612" w14:font="MS Gothic"/>
-                <w14:uncheckedState w14:val="2610" w14:font="MS Gothic"/>
-              </w14:checkbox>
-            </w:sdtPr>
-            <w:sdtContent>
-              <w:p>
-                <w:pPr>
-                  <w:jc w:val="center"/>
-                  <w:rPr>
-                    <w:b/>
-                    <w:bCs/>
-                    <w:sz w:val="40"/>
-                    <w:szCs w:val="40"/>
-                  </w:rPr>
-                </w:pPr>
-                <w:r>
-                  <w:rPr>
-                    <w:rFonts w:ascii="MS Gothic" w:eastAsia="MS Gothic" w:hAnsi="MS Gothic" w:hint="eastAsia"/>
-                    <w:b/>
-                    <w:bCs/>
-                    <w:sz w:val="40"/>
-                    <w:szCs w:val="40"/>
-                  </w:rPr>
-                  <w:t>☐</w:t>
-                </w:r>
-              </w:p>
-            </w:sdtContent>
-          </w:sdt>
+              <w:br/>
+              <w:t>+++rel_no+++</w:t>
+            </w:r>
+          </w:p>
         </w:tc>
       </w:tr>
       <w:tr>
@@ -3645,19 +3554,6 @@
                 <w:b/>
                 <w:color w:val="0000FF"/>
               </w:rPr>
-              <w:t>+++eligibilityForEmp+++</w:t>
-            </w:r>
-          </w:p>
-          <w:p>
-            <w:pPr>
-              <w:spacing w:before="0" w:after="0"/>
-              <w:jc w:val="center"/>
-            </w:pPr>
-            <w:r>
-              <w:rPr>
-                <w:b/>
-                <w:color w:val="0000FF"/>
-              </w:rPr>
               <w:t>+++jobRecommendedFor+++</w:t>
             </w:r>
           </w:p>
@@ -3673,57 +3569,20 @@
           </w:tcPr>
           <w:p>
             <w:pPr>
-              <w:jc w:val="center"/>
-              <w:rPr>
-                <w:b/>
-                <w:bCs/>
-              </w:rPr>
-            </w:pPr>
-            <w:r>
-              <w:rPr>
-                <w:b/>
-                <w:bCs/>
+              <w:spacing w:before="0" w:after="0"/>
+              <w:jc w:val="center"/>
+            </w:pPr>
+            <w:r/>
+            <w:r>
+              <w:rPr>
+                <w:b/>
+                <w:color w:val="0000FF"/>
               </w:rPr>
               <w:t>YES</w:t>
-            </w:r>
-          </w:p>
-          <w:sdt>
-            <w:sdtPr>
-              <w:rPr>
-                <w:b/>
-                <w:bCs/>
-                <w:sz w:val="40"/>
-                <w:szCs w:val="40"/>
-              </w:rPr>
-              <w:id w:val="-1530176407"/>
-              <w14:checkbox>
-                <w14:checked w14:val="0"/>
-                <w14:checkedState w14:val="2612" w14:font="MS Gothic"/>
-                <w14:uncheckedState w14:val="2610" w14:font="MS Gothic"/>
-              </w14:checkbox>
-            </w:sdtPr>
-            <w:sdtContent>
-              <w:p>
-                <w:pPr>
-                  <w:jc w:val="center"/>
-                  <w:rPr>
-                    <w:b/>
-                    <w:bCs/>
-                  </w:rPr>
-                </w:pPr>
-                <w:r>
-                  <w:rPr>
-                    <w:rFonts w:ascii="MS Gothic" w:eastAsia="MS Gothic" w:hAnsi="MS Gothic" w:hint="eastAsia"/>
-                    <w:b/>
-                    <w:bCs/>
-                    <w:sz w:val="40"/>
-                    <w:szCs w:val="40"/>
-                  </w:rPr>
-                  <w:t>☐</w:t>
-                </w:r>
-              </w:p>
-            </w:sdtContent>
-          </w:sdt>
+              <w:br/>
+              <w:t>+++elig_yes+++</w:t>
+            </w:r>
+          </w:p>
         </w:tc>
         <w:tc>
           <w:tcPr>
@@ -3736,53 +3595,20 @@
           </w:tcPr>
           <w:p>
             <w:pPr>
-              <w:jc w:val="center"/>
-              <w:rPr>
-                <w:b/>
-                <w:bCs/>
-              </w:rPr>
-            </w:pPr>
-            <w:r>
-              <w:rPr>
-                <w:b/>
-                <w:bCs/>
+              <w:spacing w:before="0" w:after="0"/>
+              <w:jc w:val="center"/>
+            </w:pPr>
+            <w:r/>
+            <w:r>
+              <w:rPr>
+                <w:b/>
+                <w:color w:val="0000FF"/>
               </w:rPr>
               <w:t>NO</w:t>
-            </w:r>
-          </w:p>
-          <w:sdt>
-            <w:sdtPr>
-              <w:rPr>
-                <w:b/>
-                <w:bCs/>
-                <w:sz w:val="40"/>
-                <w:szCs w:val="40"/>
-              </w:rPr>
-              <w:id w:val="2003688563"/>
-              <w14:checkbox>
-                <w14:checked w14:val="0"/>
-                <w14:checkedState w14:val="2612" w14:font="MS Gothic"/>
-                <w14:uncheckedState w14:val="2610" w14:font="MS Gothic"/>
-              </w14:checkbox>
-            </w:sdtPr>
-            <w:sdtContent>
-              <w:p>
-                <w:pPr>
-                  <w:jc w:val="center"/>
-                </w:pPr>
-                <w:r>
-                  <w:rPr>
-                    <w:rFonts w:ascii="MS Gothic" w:eastAsia="MS Gothic" w:hAnsi="MS Gothic" w:hint="eastAsia"/>
-                    <w:b/>
-                    <w:bCs/>
-                    <w:sz w:val="40"/>
-                    <w:szCs w:val="40"/>
-                  </w:rPr>
-                  <w:t>☐</w:t>
-                </w:r>
-              </w:p>
-            </w:sdtContent>
-          </w:sdt>
+              <w:br/>
+              <w:t>+++elig_no+++</w:t>
+            </w:r>
+          </w:p>
         </w:tc>
       </w:tr>
       <w:tr>

</xml_diff>